<commit_message>
Added zoneId and contextId HTTP header functionality
</commit_message>
<xml_diff>
--- a/98_Xslt/SpecGen-OpenAPI Elements.v1.docx
+++ b/98_Xslt/SpecGen-OpenAPI Elements.v1.docx
@@ -509,7 +509,15 @@
     </w:p>
     <w:p>
       <w:r>
-        <w:t>The &lt;OpenAPI&gt; elements are consumed by the XSLT process that produces Open API yaml/</w:t>
+        <w:t xml:space="preserve">The &lt;OpenAPI&gt; elements are consumed by the XSLT process that produces Open API </w:t>
+      </w:r>
+      <w:proofErr w:type="spellStart"/>
+      <w:r>
+        <w:t>yaml</w:t>
+      </w:r>
+      <w:proofErr w:type="spellEnd"/>
+      <w:r>
+        <w:t>/</w:t>
       </w:r>
       <w:proofErr w:type="spellStart"/>
       <w:r>
@@ -1377,143 +1385,489 @@
       <w:r>
         <w:t>s (GET &amp; HEAD)</w:t>
       </w:r>
+      <w:r>
+        <w:t>.</w:t>
+      </w:r>
+    </w:p>
+    <w:p>
+      <w:pPr>
+        <w:spacing w:before="240" w:after="0"/>
+        <w:rPr>
+          <w:b/>
+        </w:rPr>
+      </w:pPr>
+      <w:r>
+        <w:rPr>
+          <w:b/>
+        </w:rPr>
+        <w:t>Examples</w:t>
+      </w:r>
+    </w:p>
+    <w:p>
+      <w:pPr>
+        <w:spacing w:after="0"/>
+      </w:pPr>
+      <w:r>
+        <w:t xml:space="preserve">Example 1: </w:t>
+      </w:r>
+      <w:r>
+        <w:t xml:space="preserve">Exclude all batch </w:t>
+      </w:r>
+      <w:r>
+        <w:t xml:space="preserve">operations </w:t>
+      </w:r>
+      <w:r>
+        <w:t xml:space="preserve">and </w:t>
+      </w:r>
+      <w:r>
+        <w:t xml:space="preserve">the </w:t>
+      </w:r>
+      <w:r>
+        <w:t>HTTP head operations:</w:t>
+      </w:r>
+    </w:p>
+    <w:p>
+      <w:pPr>
+        <w:spacing w:after="0"/>
+        <w:rPr>
+          <w:rFonts w:ascii="Courier New" w:hAnsi="Courier New" w:cs="Courier New"/>
+        </w:rPr>
+      </w:pPr>
+      <w:r>
+        <w:rPr>
+          <w:rFonts w:ascii="Courier New" w:hAnsi="Courier New" w:cs="Courier New"/>
+        </w:rPr>
+        <w:t xml:space="preserve">   &lt;OpenAPI&gt;</w:t>
+      </w:r>
+    </w:p>
+    <w:p>
+      <w:pPr>
+        <w:spacing w:after="0"/>
+        <w:rPr>
+          <w:rFonts w:ascii="Courier New" w:hAnsi="Courier New" w:cs="Courier New"/>
+          <w:b/>
+          <w:color w:val="FF0000"/>
+        </w:rPr>
+      </w:pPr>
+      <w:r>
+        <w:rPr>
+          <w:rFonts w:ascii="Courier New" w:hAnsi="Courier New" w:cs="Courier New"/>
+          <w:color w:val="FF0000"/>
+        </w:rPr>
+        <w:t xml:space="preserve">      </w:t>
+      </w:r>
+      <w:r>
+        <w:rPr>
+          <w:rFonts w:ascii="Courier New" w:hAnsi="Courier New" w:cs="Courier New"/>
+          <w:b/>
+          <w:color w:val="FF0000"/>
+        </w:rPr>
+        <w:t>&lt;</w:t>
+      </w:r>
+      <w:proofErr w:type="spellStart"/>
+      <w:r>
+        <w:rPr>
+          <w:rFonts w:ascii="Courier New" w:hAnsi="Courier New" w:cs="Courier New"/>
+          <w:b/>
+          <w:color w:val="FF0000"/>
+        </w:rPr>
+        <w:t>ExcludeOperations</w:t>
+      </w:r>
+      <w:proofErr w:type="spellEnd"/>
+      <w:r>
+        <w:rPr>
+          <w:rFonts w:ascii="Courier New" w:hAnsi="Courier New" w:cs="Courier New"/>
+          <w:b/>
+          <w:color w:val="FF0000"/>
+        </w:rPr>
+        <w:t>&gt;</w:t>
+      </w:r>
+      <w:r>
+        <w:rPr>
+          <w:rFonts w:ascii="Courier New" w:hAnsi="Courier New" w:cs="Courier New"/>
+          <w:b/>
+        </w:rPr>
+        <w:t>all-batch,</w:t>
+      </w:r>
+      <w:r>
+        <w:rPr>
+          <w:rFonts w:ascii="Courier New" w:hAnsi="Courier New" w:cs="Courier New"/>
+          <w:b/>
+        </w:rPr>
+        <w:t xml:space="preserve"> </w:t>
+      </w:r>
+      <w:r>
+        <w:rPr>
+          <w:rFonts w:ascii="Courier New" w:hAnsi="Courier New" w:cs="Courier New"/>
+          <w:b/>
+        </w:rPr>
+        <w:t>head-single</w:t>
+      </w:r>
+      <w:r>
+        <w:rPr>
+          <w:rFonts w:ascii="Courier New" w:hAnsi="Courier New" w:cs="Courier New"/>
+          <w:b/>
+          <w:color w:val="FF0000"/>
+        </w:rPr>
+        <w:t>&lt;/</w:t>
+      </w:r>
+      <w:proofErr w:type="spellStart"/>
+      <w:r>
+        <w:rPr>
+          <w:rFonts w:ascii="Courier New" w:hAnsi="Courier New" w:cs="Courier New"/>
+          <w:b/>
+          <w:color w:val="FF0000"/>
+        </w:rPr>
+        <w:t>ExcludeOperations</w:t>
+      </w:r>
+      <w:proofErr w:type="spellEnd"/>
+      <w:r>
+        <w:rPr>
+          <w:rFonts w:ascii="Courier New" w:hAnsi="Courier New" w:cs="Courier New"/>
+          <w:b/>
+          <w:color w:val="FF0000"/>
+        </w:rPr>
+        <w:t xml:space="preserve">&gt;   </w:t>
+      </w:r>
+    </w:p>
+    <w:p>
+      <w:pPr>
+        <w:rPr>
+          <w:rFonts w:ascii="Courier New" w:hAnsi="Courier New" w:cs="Courier New"/>
+        </w:rPr>
+      </w:pPr>
+      <w:r>
+        <w:rPr>
+          <w:rFonts w:ascii="Courier New" w:hAnsi="Courier New" w:cs="Courier New"/>
+        </w:rPr>
+        <w:t xml:space="preserve">   &lt;/OpenAPI&gt;</w:t>
+      </w:r>
+    </w:p>
+    <w:p>
+      <w:pPr>
+        <w:spacing w:after="0"/>
+      </w:pPr>
+      <w:r>
+        <w:t xml:space="preserve">Example 2: </w:t>
+      </w:r>
+      <w:r>
+        <w:t>Exclude HTTP PUT (single &amp; batch) and HTTP DELETE (single &amp; batch) operations:</w:t>
+      </w:r>
+    </w:p>
+    <w:p>
+      <w:pPr>
+        <w:spacing w:after="0"/>
+        <w:rPr>
+          <w:rFonts w:ascii="Courier New" w:hAnsi="Courier New" w:cs="Courier New"/>
+        </w:rPr>
+      </w:pPr>
+      <w:r>
+        <w:rPr>
+          <w:rFonts w:ascii="Courier New" w:hAnsi="Courier New" w:cs="Courier New"/>
+        </w:rPr>
+        <w:lastRenderedPageBreak/>
+        <w:t xml:space="preserve">   &lt;OpenAPI&gt;</w:t>
+      </w:r>
+    </w:p>
+    <w:p>
+      <w:pPr>
+        <w:spacing w:after="0"/>
+        <w:rPr>
+          <w:rFonts w:ascii="Courier New" w:hAnsi="Courier New" w:cs="Courier New"/>
+          <w:b/>
+          <w:color w:val="FF0000"/>
+        </w:rPr>
+      </w:pPr>
+      <w:r>
+        <w:rPr>
+          <w:rFonts w:ascii="Courier New" w:hAnsi="Courier New" w:cs="Courier New"/>
+          <w:color w:val="FF0000"/>
+        </w:rPr>
+        <w:t xml:space="preserve">      </w:t>
+      </w:r>
+      <w:r>
+        <w:rPr>
+          <w:rFonts w:ascii="Courier New" w:hAnsi="Courier New" w:cs="Courier New"/>
+          <w:b/>
+          <w:color w:val="FF0000"/>
+        </w:rPr>
+        <w:t>&lt;</w:t>
+      </w:r>
+      <w:proofErr w:type="spellStart"/>
+      <w:r>
+        <w:rPr>
+          <w:rFonts w:ascii="Courier New" w:hAnsi="Courier New" w:cs="Courier New"/>
+          <w:b/>
+          <w:color w:val="FF0000"/>
+        </w:rPr>
+        <w:t>ExcludeOperations</w:t>
+      </w:r>
+      <w:proofErr w:type="spellEnd"/>
+      <w:r>
+        <w:rPr>
+          <w:rFonts w:ascii="Courier New" w:hAnsi="Courier New" w:cs="Courier New"/>
+          <w:b/>
+          <w:color w:val="FF0000"/>
+        </w:rPr>
+        <w:t>&gt;</w:t>
+      </w:r>
+    </w:p>
+    <w:p>
+      <w:pPr>
+        <w:spacing w:after="0"/>
+        <w:rPr>
+          <w:rFonts w:ascii="Courier New" w:hAnsi="Courier New" w:cs="Courier New"/>
+          <w:b/>
+        </w:rPr>
+      </w:pPr>
+      <w:r>
+        <w:rPr>
+          <w:rFonts w:ascii="Courier New" w:hAnsi="Courier New" w:cs="Courier New"/>
+          <w:b/>
+        </w:rPr>
+        <w:t xml:space="preserve">         </w:t>
+      </w:r>
+      <w:proofErr w:type="gramStart"/>
+      <w:r>
+        <w:rPr>
+          <w:rFonts w:ascii="Courier New" w:hAnsi="Courier New" w:cs="Courier New"/>
+          <w:b/>
+        </w:rPr>
+        <w:t>put-single</w:t>
+      </w:r>
+      <w:proofErr w:type="gramEnd"/>
+      <w:r>
+        <w:rPr>
+          <w:rFonts w:ascii="Courier New" w:hAnsi="Courier New" w:cs="Courier New"/>
+          <w:b/>
+        </w:rPr>
+        <w:t xml:space="preserve">, </w:t>
+      </w:r>
+      <w:r>
+        <w:rPr>
+          <w:rFonts w:ascii="Courier New" w:hAnsi="Courier New" w:cs="Courier New"/>
+          <w:b/>
+        </w:rPr>
+        <w:t>put-batch, delete-single ,delete-batch</w:t>
+      </w:r>
+    </w:p>
+    <w:p>
+      <w:pPr>
+        <w:spacing w:after="0"/>
+        <w:rPr>
+          <w:rFonts w:ascii="Courier New" w:hAnsi="Courier New" w:cs="Courier New"/>
+          <w:b/>
+          <w:color w:val="FF0000"/>
+        </w:rPr>
+      </w:pPr>
+      <w:r>
+        <w:rPr>
+          <w:rFonts w:ascii="Courier New" w:hAnsi="Courier New" w:cs="Courier New"/>
+          <w:b/>
+          <w:color w:val="FF0000"/>
+        </w:rPr>
+        <w:t xml:space="preserve">      &lt;/</w:t>
+      </w:r>
+      <w:proofErr w:type="spellStart"/>
+      <w:r>
+        <w:rPr>
+          <w:rFonts w:ascii="Courier New" w:hAnsi="Courier New" w:cs="Courier New"/>
+          <w:b/>
+          <w:color w:val="FF0000"/>
+        </w:rPr>
+        <w:t>ExcludeOperations</w:t>
+      </w:r>
+      <w:proofErr w:type="spellEnd"/>
+      <w:r>
+        <w:rPr>
+          <w:rFonts w:ascii="Courier New" w:hAnsi="Courier New" w:cs="Courier New"/>
+          <w:b/>
+          <w:color w:val="FF0000"/>
+        </w:rPr>
+        <w:t xml:space="preserve">&gt;   </w:t>
+      </w:r>
+    </w:p>
+    <w:p>
+      <w:pPr>
+        <w:spacing w:after="0"/>
+        <w:rPr>
+          <w:rFonts w:ascii="Courier New" w:hAnsi="Courier New" w:cs="Courier New"/>
+        </w:rPr>
+      </w:pPr>
+      <w:r>
+        <w:rPr>
+          <w:rFonts w:ascii="Courier New" w:hAnsi="Courier New" w:cs="Courier New"/>
+        </w:rPr>
+        <w:t xml:space="preserve">   &lt;/OpenAPI&gt;</w:t>
+      </w:r>
+    </w:p>
+    <w:p>
+      <w:pPr>
+        <w:spacing w:after="0"/>
+        <w:rPr>
+          <w:rFonts w:ascii="Courier New" w:hAnsi="Courier New" w:cs="Courier New"/>
+        </w:rPr>
+      </w:pPr>
+    </w:p>
+    <w:p>
+      <w:pPr>
+        <w:pStyle w:val="Heading3"/>
+      </w:pPr>
+      <w:r>
+        <w:t>Zone and Context Support</w:t>
+      </w:r>
+    </w:p>
+    <w:p>
+      <w:r>
+        <w:t xml:space="preserve">Since SIF Infrastructure version 3.7 the zoneId and contextId are being conveyed as HTTP Headers. Prior to SIF </w:t>
+      </w:r>
+      <w:r>
+        <w:t>Infrastructure version 3.7</w:t>
+      </w:r>
+      <w:r>
+        <w:t xml:space="preserve"> these two values were conveyed as matrix parameters. By default the zoneId and contextId are added to all API endpoints. There are services however that do not support the concept of zone and context. These services should not list the zoneId and contextId as HTTP headers. To disable these HTTP headers to be part of a service the </w:t>
+      </w:r>
+      <w:r>
+        <w:rPr>
+          <w:rFonts w:ascii="Courier New" w:hAnsi="Courier New" w:cs="Courier New"/>
+          <w:b/>
+          <w:sz w:val="20"/>
+          <w:szCs w:val="20"/>
+        </w:rPr>
+        <w:t>&lt;</w:t>
+      </w:r>
+      <w:proofErr w:type="spellStart"/>
+      <w:r>
+        <w:rPr>
+          <w:rFonts w:ascii="Courier New" w:hAnsi="Courier New" w:cs="Courier New"/>
+          <w:b/>
+          <w:sz w:val="20"/>
+          <w:szCs w:val="20"/>
+        </w:rPr>
+        <w:t>ZoneContextSupported</w:t>
+      </w:r>
+      <w:proofErr w:type="spellEnd"/>
+      <w:r>
+        <w:rPr>
+          <w:rFonts w:ascii="Courier New" w:hAnsi="Courier New" w:cs="Courier New"/>
+          <w:b/>
+          <w:sz w:val="20"/>
+          <w:szCs w:val="20"/>
+        </w:rPr>
+        <w:t>&gt;</w:t>
+      </w:r>
+      <w:r>
+        <w:t xml:space="preserve"> tag can be added under the </w:t>
+      </w:r>
+      <w:r>
+        <w:rPr>
+          <w:rFonts w:ascii="Courier New" w:hAnsi="Courier New" w:cs="Courier New"/>
+          <w:b/>
+          <w:sz w:val="20"/>
+          <w:szCs w:val="20"/>
+        </w:rPr>
+        <w:t>&lt;OpenAPI&gt;</w:t>
+      </w:r>
+      <w:r>
+        <w:t xml:space="preserve"> node. Valid values are true (zone and context supported) and false (zone and context not supported). If not provided then it is defaulted to true.</w:t>
+      </w:r>
+    </w:p>
+    <w:p>
+      <w:pPr>
+        <w:spacing w:after="0"/>
+      </w:pPr>
+      <w:r>
+        <w:t>Example:</w:t>
+      </w:r>
+    </w:p>
+    <w:p>
+      <w:r>
+        <w:t>The environment service in the infrastructure data model doesn’t support zone and context. Hence it must be excluded for that service:</w:t>
+      </w:r>
+    </w:p>
+    <w:p>
+      <w:pPr>
+        <w:spacing w:after="0"/>
+        <w:rPr>
+          <w:rFonts w:ascii="Courier New" w:hAnsi="Courier New" w:cs="Courier New"/>
+        </w:rPr>
+      </w:pPr>
+      <w:r>
+        <w:rPr>
+          <w:rFonts w:ascii="Courier New" w:hAnsi="Courier New" w:cs="Courier New"/>
+        </w:rPr>
+        <w:t xml:space="preserve">   &lt;OpenAPI&gt;</w:t>
+      </w:r>
+    </w:p>
+    <w:p>
+      <w:pPr>
+        <w:spacing w:after="0"/>
+        <w:rPr>
+          <w:rFonts w:ascii="Courier New" w:hAnsi="Courier New" w:cs="Courier New"/>
+          <w:b/>
+          <w:color w:val="FF0000"/>
+        </w:rPr>
+      </w:pPr>
+      <w:r>
+        <w:rPr>
+          <w:rFonts w:ascii="Courier New" w:hAnsi="Courier New" w:cs="Courier New"/>
+          <w:color w:val="FF0000"/>
+        </w:rPr>
+        <w:t xml:space="preserve">      </w:t>
+      </w:r>
+      <w:r>
+        <w:rPr>
+          <w:rFonts w:ascii="Courier New" w:hAnsi="Courier New" w:cs="Courier New"/>
+          <w:b/>
+          <w:color w:val="FF0000"/>
+        </w:rPr>
+        <w:t>&lt;</w:t>
+      </w:r>
+      <w:proofErr w:type="spellStart"/>
+      <w:r>
+        <w:rPr>
+          <w:rFonts w:ascii="Courier New" w:hAnsi="Courier New" w:cs="Courier New"/>
+          <w:b/>
+          <w:color w:val="FF0000"/>
+        </w:rPr>
+        <w:t>ZoneContextSupported</w:t>
+      </w:r>
+      <w:proofErr w:type="spellEnd"/>
+      <w:r>
+        <w:rPr>
+          <w:rFonts w:ascii="Courier New" w:hAnsi="Courier New" w:cs="Courier New"/>
+          <w:b/>
+          <w:color w:val="FF0000"/>
+        </w:rPr>
+        <w:t>&gt;</w:t>
+      </w:r>
+      <w:r>
+        <w:rPr>
+          <w:rFonts w:ascii="Courier New" w:hAnsi="Courier New" w:cs="Courier New"/>
+          <w:b/>
+          <w:color w:val="FF0000"/>
+        </w:rPr>
+        <w:t>false</w:t>
+      </w:r>
+      <w:r>
+        <w:rPr>
+          <w:rFonts w:ascii="Courier New" w:hAnsi="Courier New" w:cs="Courier New"/>
+          <w:b/>
+          <w:color w:val="FF0000"/>
+        </w:rPr>
+        <w:t>&lt;/</w:t>
+      </w:r>
+      <w:proofErr w:type="spellStart"/>
+      <w:r>
+        <w:rPr>
+          <w:rFonts w:ascii="Courier New" w:hAnsi="Courier New" w:cs="Courier New"/>
+          <w:b/>
+          <w:color w:val="FF0000"/>
+        </w:rPr>
+        <w:t>ZoneContextSupported</w:t>
+      </w:r>
       <w:bookmarkStart w:id="3" w:name="_GoBack"/>
       <w:bookmarkEnd w:id="3"/>
-      <w:r>
-        <w:t>.</w:t>
-      </w:r>
-    </w:p>
-    <w:p>
-      <w:pPr>
-        <w:spacing w:before="240" w:after="0"/>
-        <w:rPr>
-          <w:b/>
-        </w:rPr>
-      </w:pPr>
-      <w:r>
-        <w:rPr>
-          <w:b/>
-        </w:rPr>
-        <w:t>Examples</w:t>
-      </w:r>
-    </w:p>
-    <w:p>
-      <w:pPr>
-        <w:spacing w:after="0"/>
-      </w:pPr>
-      <w:r>
-        <w:t xml:space="preserve">Example 1: </w:t>
-      </w:r>
-      <w:r>
-        <w:t xml:space="preserve">Exclude all batch </w:t>
-      </w:r>
-      <w:r>
-        <w:t xml:space="preserve">operations </w:t>
-      </w:r>
-      <w:r>
-        <w:t xml:space="preserve">and </w:t>
-      </w:r>
-      <w:r>
-        <w:t xml:space="preserve">the </w:t>
-      </w:r>
-      <w:r>
-        <w:t>HTTP head operations:</w:t>
-      </w:r>
-    </w:p>
-    <w:p>
-      <w:pPr>
-        <w:spacing w:after="0"/>
-        <w:rPr>
-          <w:rFonts w:ascii="Courier New" w:hAnsi="Courier New" w:cs="Courier New"/>
-        </w:rPr>
-      </w:pPr>
-      <w:r>
-        <w:rPr>
-          <w:rFonts w:ascii="Courier New" w:hAnsi="Courier New" w:cs="Courier New"/>
-        </w:rPr>
-        <w:t xml:space="preserve">   &lt;OpenAPI&gt;</w:t>
-      </w:r>
-    </w:p>
-    <w:p>
-      <w:pPr>
-        <w:spacing w:after="0"/>
-        <w:rPr>
-          <w:rFonts w:ascii="Courier New" w:hAnsi="Courier New" w:cs="Courier New"/>
-          <w:b/>
-          <w:color w:val="FF0000"/>
-        </w:rPr>
-      </w:pPr>
-      <w:r>
-        <w:rPr>
-          <w:rFonts w:ascii="Courier New" w:hAnsi="Courier New" w:cs="Courier New"/>
-          <w:color w:val="FF0000"/>
-        </w:rPr>
-        <w:t xml:space="preserve">      </w:t>
-      </w:r>
-      <w:r>
-        <w:rPr>
-          <w:rFonts w:ascii="Courier New" w:hAnsi="Courier New" w:cs="Courier New"/>
-          <w:b/>
-          <w:color w:val="FF0000"/>
-        </w:rPr>
-        <w:t>&lt;</w:t>
-      </w:r>
-      <w:proofErr w:type="spellStart"/>
-      <w:r>
-        <w:rPr>
-          <w:rFonts w:ascii="Courier New" w:hAnsi="Courier New" w:cs="Courier New"/>
-          <w:b/>
-          <w:color w:val="FF0000"/>
-        </w:rPr>
-        <w:t>ExcludeOperations</w:t>
-      </w:r>
-      <w:proofErr w:type="spellEnd"/>
-      <w:r>
-        <w:rPr>
-          <w:rFonts w:ascii="Courier New" w:hAnsi="Courier New" w:cs="Courier New"/>
-          <w:b/>
-          <w:color w:val="FF0000"/>
-        </w:rPr>
-        <w:t>&gt;</w:t>
-      </w:r>
-      <w:r>
-        <w:rPr>
-          <w:rFonts w:ascii="Courier New" w:hAnsi="Courier New" w:cs="Courier New"/>
-          <w:b/>
-        </w:rPr>
-        <w:t>all-batch,</w:t>
-      </w:r>
-      <w:r>
-        <w:rPr>
-          <w:rFonts w:ascii="Courier New" w:hAnsi="Courier New" w:cs="Courier New"/>
-          <w:b/>
-        </w:rPr>
-        <w:t xml:space="preserve"> </w:t>
-      </w:r>
-      <w:r>
-        <w:rPr>
-          <w:rFonts w:ascii="Courier New" w:hAnsi="Courier New" w:cs="Courier New"/>
-          <w:b/>
-        </w:rPr>
-        <w:t>head-single</w:t>
-      </w:r>
-      <w:r>
-        <w:rPr>
-          <w:rFonts w:ascii="Courier New" w:hAnsi="Courier New" w:cs="Courier New"/>
-          <w:b/>
-          <w:color w:val="FF0000"/>
-        </w:rPr>
-        <w:t>&lt;/</w:t>
-      </w:r>
-      <w:proofErr w:type="spellStart"/>
-      <w:r>
-        <w:rPr>
-          <w:rFonts w:ascii="Courier New" w:hAnsi="Courier New" w:cs="Courier New"/>
-          <w:b/>
-          <w:color w:val="FF0000"/>
-        </w:rPr>
-        <w:t>ExcludeOperations</w:t>
-      </w:r>
       <w:proofErr w:type="spellEnd"/>
       <w:r>
         <w:rPr>
@@ -1526,6 +1880,7 @@
     </w:p>
     <w:p>
       <w:pPr>
+        <w:spacing w:after="0"/>
         <w:rPr>
           <w:rFonts w:ascii="Courier New" w:hAnsi="Courier New" w:cs="Courier New"/>
         </w:rPr>
@@ -1537,164 +1892,7 @@
         <w:t xml:space="preserve">   &lt;/OpenAPI&gt;</w:t>
       </w:r>
     </w:p>
-    <w:p>
-      <w:pPr>
-        <w:spacing w:after="0"/>
-      </w:pPr>
-      <w:r>
-        <w:t xml:space="preserve">Example 2: </w:t>
-      </w:r>
-      <w:r>
-        <w:t>Exclude HTTP PUT (single &amp; batch) and HTTP DELETE (single &amp; batch) operations:</w:t>
-      </w:r>
-    </w:p>
-    <w:p>
-      <w:pPr>
-        <w:spacing w:after="0"/>
-        <w:rPr>
-          <w:rFonts w:ascii="Courier New" w:hAnsi="Courier New" w:cs="Courier New"/>
-        </w:rPr>
-      </w:pPr>
-      <w:r>
-        <w:rPr>
-          <w:rFonts w:ascii="Courier New" w:hAnsi="Courier New" w:cs="Courier New"/>
-        </w:rPr>
-        <w:lastRenderedPageBreak/>
-        <w:t xml:space="preserve">   &lt;OpenAPI&gt;</w:t>
-      </w:r>
-    </w:p>
-    <w:p>
-      <w:pPr>
-        <w:spacing w:after="0"/>
-        <w:rPr>
-          <w:rFonts w:ascii="Courier New" w:hAnsi="Courier New" w:cs="Courier New"/>
-          <w:b/>
-          <w:color w:val="FF0000"/>
-        </w:rPr>
-      </w:pPr>
-      <w:r>
-        <w:rPr>
-          <w:rFonts w:ascii="Courier New" w:hAnsi="Courier New" w:cs="Courier New"/>
-          <w:color w:val="FF0000"/>
-        </w:rPr>
-        <w:t xml:space="preserve">      </w:t>
-      </w:r>
-      <w:r>
-        <w:rPr>
-          <w:rFonts w:ascii="Courier New" w:hAnsi="Courier New" w:cs="Courier New"/>
-          <w:b/>
-          <w:color w:val="FF0000"/>
-        </w:rPr>
-        <w:t>&lt;</w:t>
-      </w:r>
-      <w:proofErr w:type="spellStart"/>
-      <w:r>
-        <w:rPr>
-          <w:rFonts w:ascii="Courier New" w:hAnsi="Courier New" w:cs="Courier New"/>
-          <w:b/>
-          <w:color w:val="FF0000"/>
-        </w:rPr>
-        <w:t>ExcludeOperations</w:t>
-      </w:r>
-      <w:proofErr w:type="spellEnd"/>
-      <w:r>
-        <w:rPr>
-          <w:rFonts w:ascii="Courier New" w:hAnsi="Courier New" w:cs="Courier New"/>
-          <w:b/>
-          <w:color w:val="FF0000"/>
-        </w:rPr>
-        <w:t>&gt;</w:t>
-      </w:r>
-    </w:p>
-    <w:p>
-      <w:pPr>
-        <w:spacing w:after="0"/>
-        <w:rPr>
-          <w:rFonts w:ascii="Courier New" w:hAnsi="Courier New" w:cs="Courier New"/>
-          <w:b/>
-        </w:rPr>
-      </w:pPr>
-      <w:r>
-        <w:rPr>
-          <w:rFonts w:ascii="Courier New" w:hAnsi="Courier New" w:cs="Courier New"/>
-          <w:b/>
-        </w:rPr>
-        <w:t xml:space="preserve">         </w:t>
-      </w:r>
-      <w:proofErr w:type="gramStart"/>
-      <w:r>
-        <w:rPr>
-          <w:rFonts w:ascii="Courier New" w:hAnsi="Courier New" w:cs="Courier New"/>
-          <w:b/>
-        </w:rPr>
-        <w:t>put-single</w:t>
-      </w:r>
-      <w:proofErr w:type="gramEnd"/>
-      <w:r>
-        <w:rPr>
-          <w:rFonts w:ascii="Courier New" w:hAnsi="Courier New" w:cs="Courier New"/>
-          <w:b/>
-        </w:rPr>
-        <w:t xml:space="preserve">, </w:t>
-      </w:r>
-      <w:r>
-        <w:rPr>
-          <w:rFonts w:ascii="Courier New" w:hAnsi="Courier New" w:cs="Courier New"/>
-          <w:b/>
-        </w:rPr>
-        <w:t>put-batch, delete-single ,delete-batch</w:t>
-      </w:r>
-    </w:p>
-    <w:p>
-      <w:pPr>
-        <w:spacing w:after="0"/>
-        <w:rPr>
-          <w:rFonts w:ascii="Courier New" w:hAnsi="Courier New" w:cs="Courier New"/>
-          <w:b/>
-          <w:color w:val="FF0000"/>
-        </w:rPr>
-      </w:pPr>
-      <w:r>
-        <w:rPr>
-          <w:rFonts w:ascii="Courier New" w:hAnsi="Courier New" w:cs="Courier New"/>
-          <w:b/>
-          <w:color w:val="FF0000"/>
-        </w:rPr>
-        <w:t xml:space="preserve">      &lt;/</w:t>
-      </w:r>
-      <w:proofErr w:type="spellStart"/>
-      <w:r>
-        <w:rPr>
-          <w:rFonts w:ascii="Courier New" w:hAnsi="Courier New" w:cs="Courier New"/>
-          <w:b/>
-          <w:color w:val="FF0000"/>
-        </w:rPr>
-        <w:t>ExcludeOperations</w:t>
-      </w:r>
-      <w:proofErr w:type="spellEnd"/>
-      <w:r>
-        <w:rPr>
-          <w:rFonts w:ascii="Courier New" w:hAnsi="Courier New" w:cs="Courier New"/>
-          <w:b/>
-          <w:color w:val="FF0000"/>
-        </w:rPr>
-        <w:t xml:space="preserve">&gt;   </w:t>
-      </w:r>
-    </w:p>
-    <w:p>
-      <w:pPr>
-        <w:spacing w:after="0"/>
-        <w:rPr>
-          <w:rFonts w:ascii="Courier New" w:hAnsi="Courier New" w:cs="Courier New"/>
-        </w:rPr>
-      </w:pPr>
-      <w:r>
-        <w:rPr>
-          <w:rFonts w:ascii="Courier New" w:hAnsi="Courier New" w:cs="Courier New"/>
-        </w:rPr>
-        <w:t xml:space="preserve">   &lt;/OpenAPI&gt;</w:t>
-      </w:r>
-    </w:p>
+    <w:p/>
     <w:p>
       <w:pPr>
         <w:pStyle w:val="Heading3"/>
@@ -1981,6 +2179,7 @@
         <w:rPr>
           <w:rFonts w:ascii="Courier New" w:hAnsi="Courier New" w:cs="Courier New"/>
         </w:rPr>
+        <w:lastRenderedPageBreak/>
         <w:t xml:space="preserve">   &lt;/OpenAPI&gt;</w:t>
       </w:r>
     </w:p>
@@ -2169,7 +2368,6 @@
         </w:numPr>
       </w:pPr>
       <w:r>
-        <w:lastRenderedPageBreak/>
         <w:t>If not provided then 'true' is assumed for 'batch' operations</w:t>
       </w:r>
     </w:p>
@@ -2649,6 +2847,7 @@
     </w:p>
     <w:p>
       <w:r>
+        <w:lastRenderedPageBreak/>
         <w:t xml:space="preserve">An object doesn’t support the </w:t>
       </w:r>
       <w:r>
@@ -3143,7 +3342,6 @@
         <w:rPr>
           <w:rFonts w:ascii="Courier New" w:hAnsi="Courier New" w:cs="Courier New"/>
         </w:rPr>
-        <w:lastRenderedPageBreak/>
         <w:t xml:space="preserve">            </w:t>
       </w:r>
       <w:proofErr w:type="spellStart"/>
@@ -3494,6 +3692,7 @@
         <w:rPr>
           <w:b/>
         </w:rPr>
+        <w:lastRenderedPageBreak/>
         <w:t>Ref</w:t>
       </w:r>
       <w:r>
@@ -3543,7 +3742,15 @@
         <w:t>are defined</w:t>
       </w:r>
       <w:r>
-        <w:t xml:space="preserve"> in a static yaml file called </w:t>
+        <w:t xml:space="preserve"> in a static </w:t>
+      </w:r>
+      <w:proofErr w:type="spellStart"/>
+      <w:r>
+        <w:t>yaml</w:t>
+      </w:r>
+      <w:proofErr w:type="spellEnd"/>
+      <w:r>
+        <w:t xml:space="preserve"> file called </w:t>
       </w:r>
       <w:proofErr w:type="spellStart"/>
       <w:r>
@@ -3955,405 +4162,405 @@
           <w:b/>
           <w:color w:val="FF0000"/>
         </w:rPr>
+        <w:t xml:space="preserve">            &lt;URI&gt;/job</w:t>
+      </w:r>
+      <w:proofErr w:type="gramStart"/>
+      <w:r>
+        <w:rPr>
+          <w:rFonts w:ascii="Courier New" w:hAnsi="Courier New" w:cs="Courier New"/>
+          <w:b/>
+          <w:color w:val="FF0000"/>
+        </w:rPr>
+        <w:t>/{</w:t>
+      </w:r>
+      <w:proofErr w:type="gramEnd"/>
+      <w:r>
+        <w:rPr>
+          <w:rFonts w:ascii="Courier New" w:hAnsi="Courier New" w:cs="Courier New"/>
+          <w:b/>
+          <w:color w:val="FF0000"/>
+        </w:rPr>
+        <w:t>id}/{</w:t>
+      </w:r>
+      <w:proofErr w:type="spellStart"/>
+      <w:r>
+        <w:rPr>
+          <w:rFonts w:ascii="Courier New" w:hAnsi="Courier New" w:cs="Courier New"/>
+          <w:b/>
+          <w:color w:val="FF0000"/>
+        </w:rPr>
+        <w:t>phaseName</w:t>
+      </w:r>
+      <w:proofErr w:type="spellEnd"/>
+      <w:r>
+        <w:rPr>
+          <w:rFonts w:ascii="Courier New" w:hAnsi="Courier New" w:cs="Courier New"/>
+          <w:b/>
+          <w:color w:val="FF0000"/>
+        </w:rPr>
+        <w:t>}/states/state&lt;/URI&gt;</w:t>
+      </w:r>
+    </w:p>
+    <w:p>
+      <w:pPr>
+        <w:spacing w:after="0"/>
+        <w:rPr>
+          <w:rFonts w:ascii="Courier New" w:hAnsi="Courier New" w:cs="Courier New"/>
+          <w:b/>
+          <w:color w:val="FF0000"/>
+        </w:rPr>
+      </w:pPr>
+      <w:r>
+        <w:rPr>
+          <w:rFonts w:ascii="Courier New" w:hAnsi="Courier New" w:cs="Courier New"/>
+          <w:b/>
+          <w:color w:val="FF0000"/>
+        </w:rPr>
+        <w:t xml:space="preserve">            &lt;Ref&gt;</w:t>
+      </w:r>
+    </w:p>
+    <w:p>
+      <w:pPr>
+        <w:spacing w:after="0"/>
+        <w:rPr>
+          <w:rFonts w:ascii="Courier New" w:hAnsi="Courier New" w:cs="Courier New"/>
+          <w:b/>
+          <w:color w:val="FF0000"/>
+        </w:rPr>
+      </w:pPr>
+      <w:r>
+        <w:rPr>
+          <w:rFonts w:ascii="Courier New" w:hAnsi="Courier New" w:cs="Courier New"/>
+          <w:b/>
+          <w:color w:val="FF0000"/>
+        </w:rPr>
+        <w:t xml:space="preserve">               </w:t>
+      </w:r>
+      <w:proofErr w:type="spellStart"/>
+      <w:r>
+        <w:rPr>
+          <w:rFonts w:ascii="Courier New" w:hAnsi="Courier New" w:cs="Courier New"/>
+          <w:b/>
+          <w:color w:val="FF0000"/>
+        </w:rPr>
+        <w:t>infraPaths.yaml</w:t>
+      </w:r>
+      <w:proofErr w:type="spellEnd"/>
+      <w:r>
+        <w:rPr>
+          <w:rFonts w:ascii="Courier New" w:hAnsi="Courier New" w:cs="Courier New"/>
+          <w:b/>
+          <w:color w:val="FF0000"/>
+        </w:rPr>
+        <w:t>#/</w:t>
+      </w:r>
+      <w:proofErr w:type="spellStart"/>
+      <w:r>
+        <w:rPr>
+          <w:rFonts w:ascii="Courier New" w:hAnsi="Courier New" w:cs="Courier New"/>
+          <w:b/>
+          <w:color w:val="FF0000"/>
+        </w:rPr>
+        <w:t>infraPaths</w:t>
+      </w:r>
+      <w:proofErr w:type="spellEnd"/>
+      <w:r>
+        <w:rPr>
+          <w:rFonts w:ascii="Courier New" w:hAnsi="Courier New" w:cs="Courier New"/>
+          <w:b/>
+          <w:color w:val="FF0000"/>
+        </w:rPr>
+        <w:t>/</w:t>
+      </w:r>
+      <w:proofErr w:type="spellStart"/>
+      <w:r>
+        <w:rPr>
+          <w:rFonts w:ascii="Courier New" w:hAnsi="Courier New" w:cs="Courier New"/>
+          <w:b/>
+          <w:color w:val="FF0000"/>
+        </w:rPr>
+        <w:t>jobPhaseStatesPost</w:t>
+      </w:r>
+      <w:proofErr w:type="spellEnd"/>
+    </w:p>
+    <w:p>
+      <w:pPr>
+        <w:spacing w:after="0"/>
+        <w:rPr>
+          <w:rFonts w:ascii="Courier New" w:hAnsi="Courier New" w:cs="Courier New"/>
+          <w:b/>
+          <w:color w:val="FF0000"/>
+        </w:rPr>
+      </w:pPr>
+      <w:r>
+        <w:rPr>
+          <w:rFonts w:ascii="Courier New" w:hAnsi="Courier New" w:cs="Courier New"/>
+          <w:b/>
+          <w:color w:val="FF0000"/>
+        </w:rPr>
+        <w:t xml:space="preserve">            &lt;/Ref&gt;</w:t>
+      </w:r>
+    </w:p>
+    <w:p>
+      <w:pPr>
+        <w:spacing w:after="0"/>
+        <w:rPr>
+          <w:rFonts w:ascii="Courier New" w:hAnsi="Courier New" w:cs="Courier New"/>
+        </w:rPr>
+      </w:pPr>
+      <w:r>
+        <w:rPr>
+          <w:rFonts w:ascii="Courier New" w:hAnsi="Courier New" w:cs="Courier New"/>
+        </w:rPr>
+        <w:t xml:space="preserve">         &lt;/Path&gt;</w:t>
+      </w:r>
+    </w:p>
+    <w:p>
+      <w:pPr>
+        <w:spacing w:after="0"/>
+        <w:rPr>
+          <w:rFonts w:ascii="Courier New" w:hAnsi="Courier New" w:cs="Courier New"/>
+        </w:rPr>
+      </w:pPr>
+      <w:r>
+        <w:rPr>
+          <w:rFonts w:ascii="Courier New" w:hAnsi="Courier New" w:cs="Courier New"/>
+        </w:rPr>
+        <w:t xml:space="preserve">      &lt;/Paths&gt;</w:t>
+      </w:r>
+    </w:p>
+    <w:p>
+      <w:pPr>
+        <w:spacing w:after="0"/>
+        <w:rPr>
+          <w:rFonts w:ascii="Courier New" w:hAnsi="Courier New" w:cs="Courier New"/>
+        </w:rPr>
+      </w:pPr>
+      <w:r>
+        <w:rPr>
+          <w:rFonts w:ascii="Courier New" w:hAnsi="Courier New" w:cs="Courier New"/>
+        </w:rPr>
+        <w:t xml:space="preserve">   &lt;/OpenAPI&gt;</w:t>
+      </w:r>
+    </w:p>
+    <w:p>
+      <w:pPr>
+        <w:spacing w:after="0"/>
+        <w:rPr>
+          <w:rFonts w:ascii="Courier New" w:hAnsi="Courier New" w:cs="Courier New"/>
+        </w:rPr>
+      </w:pPr>
+      <w:r>
+        <w:rPr>
+          <w:rFonts w:ascii="Courier New" w:hAnsi="Courier New" w:cs="Courier New"/>
+        </w:rPr>
+        <w:t xml:space="preserve">   ...</w:t>
+      </w:r>
+    </w:p>
+    <w:p>
+      <w:pPr>
+        <w:spacing w:after="0"/>
+        <w:rPr>
+          <w:rFonts w:ascii="Courier New" w:hAnsi="Courier New" w:cs="Courier New"/>
+        </w:rPr>
+      </w:pPr>
+      <w:r>
+        <w:rPr>
+          <w:rFonts w:ascii="Courier New" w:hAnsi="Courier New" w:cs="Courier New"/>
+        </w:rPr>
+        <w:t>&lt;</w:t>
+      </w:r>
+      <w:r>
+        <w:rPr>
+          <w:rFonts w:ascii="Courier New" w:hAnsi="Courier New" w:cs="Courier New"/>
+        </w:rPr>
+        <w:t>/</w:t>
+      </w:r>
+      <w:proofErr w:type="spellStart"/>
+      <w:r>
+        <w:rPr>
+          <w:rFonts w:ascii="Courier New" w:hAnsi="Courier New" w:cs="Courier New"/>
+        </w:rPr>
+        <w:t>DataObject</w:t>
+      </w:r>
+      <w:proofErr w:type="spellEnd"/>
+      <w:r>
+        <w:rPr>
+          <w:rFonts w:ascii="Courier New" w:hAnsi="Courier New" w:cs="Courier New"/>
+        </w:rPr>
+        <w:t>&gt;</w:t>
+      </w:r>
+    </w:p>
+    <w:p>
+      <w:pPr>
+        <w:pStyle w:val="Heading2"/>
+      </w:pPr>
+      <w:bookmarkStart w:id="6" w:name="_Toc73345488"/>
+      <w:r>
+        <w:t>Group</w:t>
+      </w:r>
+      <w:r>
+        <w:t xml:space="preserve"> – &lt;OpenAPI&gt; Elements</w:t>
+      </w:r>
+      <w:bookmarkEnd w:id="6"/>
+    </w:p>
+    <w:p>
+      <w:r>
+        <w:t xml:space="preserve">The SpecGen source files may have some objects grouped </w:t>
+      </w:r>
+      <w:r>
+        <w:t>within</w:t>
+      </w:r>
+      <w:r>
+        <w:t xml:space="preserve"> a certain area; however these objects are not top-level objects that should be appearing in the final Open API definition as an endpoint. One such object is the ‘</w:t>
+      </w:r>
+      <w:proofErr w:type="spellStart"/>
+      <w:r>
+        <w:t>deleteRequest</w:t>
+      </w:r>
+      <w:proofErr w:type="spellEnd"/>
+      <w:r>
+        <w:t xml:space="preserve">’ in the infrastructure data model that is listed in the ‘request’ group. This object is an object that is used as payload for a standard data model delete request but it is not an endpoint in its own right, so that object as well as the group it belongs should not form part of the Open API </w:t>
+      </w:r>
+      <w:r>
+        <w:t xml:space="preserve">endpoint </w:t>
+      </w:r>
+      <w:r>
+        <w:t>definition.</w:t>
+      </w:r>
+    </w:p>
+    <w:p>
+      <w:r>
+        <w:t>How to exclude a specific &lt;</w:t>
+      </w:r>
+      <w:proofErr w:type="spellStart"/>
+      <w:r>
+        <w:t>DataObject</w:t>
+      </w:r>
+      <w:proofErr w:type="spellEnd"/>
+      <w:r>
+        <w:t>&gt; from the output has been described in the previous section. Just excluding the unnecessary objects would still</w:t>
+      </w:r>
+      <w:r>
+        <w:t xml:space="preserve"> produce the group name i</w:t>
+      </w:r>
+      <w:r>
+        <w:t>n the final OpenAPI yaml file without any objects. To also exclude the group name/heading from the final Open API yaml the following &lt;OpenAPI&gt; element can be added to the &lt;Group&gt; element:</w:t>
+      </w:r>
+    </w:p>
+    <w:p>
+      <w:pPr>
+        <w:spacing w:after="0"/>
+        <w:rPr>
+          <w:b/>
+        </w:rPr>
+      </w:pPr>
+      <w:r>
+        <w:rPr>
+          <w:b/>
+        </w:rPr>
+        <w:t>Example:</w:t>
+      </w:r>
+    </w:p>
+    <w:p>
+      <w:pPr>
+        <w:spacing w:after="0"/>
+        <w:rPr>
+          <w:rFonts w:ascii="Courier New" w:hAnsi="Courier New" w:cs="Courier New"/>
+        </w:rPr>
+      </w:pPr>
+      <w:r>
+        <w:rPr>
+          <w:rFonts w:ascii="Courier New" w:hAnsi="Courier New" w:cs="Courier New"/>
+        </w:rPr>
+        <w:t>&lt;Group name="..."&gt;</w:t>
+      </w:r>
+    </w:p>
+    <w:p>
+      <w:pPr>
+        <w:spacing w:after="0"/>
+        <w:rPr>
+          <w:rFonts w:ascii="Courier New" w:hAnsi="Courier New" w:cs="Courier New"/>
+        </w:rPr>
+      </w:pPr>
+      <w:r>
+        <w:rPr>
+          <w:rFonts w:ascii="Courier New" w:hAnsi="Courier New" w:cs="Courier New"/>
+        </w:rPr>
+        <w:t xml:space="preserve">   &lt;OpenAPI&gt;</w:t>
+      </w:r>
+    </w:p>
+    <w:p>
+      <w:pPr>
+        <w:spacing w:after="0"/>
+        <w:rPr>
+          <w:rFonts w:ascii="Courier New" w:hAnsi="Courier New" w:cs="Courier New"/>
+          <w:b/>
+        </w:rPr>
+      </w:pPr>
+      <w:r>
+        <w:rPr>
+          <w:rFonts w:ascii="Courier New" w:hAnsi="Courier New" w:cs="Courier New"/>
+        </w:rPr>
+        <w:t xml:space="preserve">      </w:t>
+      </w:r>
+      <w:r>
+        <w:rPr>
+          <w:rFonts w:ascii="Courier New" w:hAnsi="Courier New" w:cs="Courier New"/>
+          <w:b/>
+          <w:color w:val="FF0000"/>
+        </w:rPr>
+        <w:t>&lt;</w:t>
+      </w:r>
+      <w:proofErr w:type="spellStart"/>
+      <w:r>
+        <w:rPr>
+          <w:rFonts w:ascii="Courier New" w:hAnsi="Courier New" w:cs="Courier New"/>
+          <w:b/>
+          <w:color w:val="FF0000"/>
+        </w:rPr>
+        <w:t>ExcludeGroupName</w:t>
+      </w:r>
+      <w:proofErr w:type="spellEnd"/>
+      <w:r>
+        <w:rPr>
+          <w:rFonts w:ascii="Courier New" w:hAnsi="Courier New" w:cs="Courier New"/>
+          <w:b/>
+          <w:color w:val="FF0000"/>
+        </w:rPr>
+        <w:t>&gt;true&lt;/</w:t>
+      </w:r>
+      <w:proofErr w:type="spellStart"/>
+      <w:r>
+        <w:rPr>
+          <w:rFonts w:ascii="Courier New" w:hAnsi="Courier New" w:cs="Courier New"/>
+          <w:b/>
+          <w:color w:val="FF0000"/>
+        </w:rPr>
+        <w:t>ExcludeGroupName</w:t>
+      </w:r>
+      <w:proofErr w:type="spellEnd"/>
+      <w:r>
+        <w:rPr>
+          <w:rFonts w:ascii="Courier New" w:hAnsi="Courier New" w:cs="Courier New"/>
+          <w:b/>
+          <w:color w:val="FF0000"/>
+        </w:rPr>
+        <w:t>&gt;</w:t>
+      </w:r>
+    </w:p>
+    <w:p>
+      <w:pPr>
+        <w:spacing w:after="0"/>
+        <w:rPr>
+          <w:rFonts w:ascii="Courier New" w:hAnsi="Courier New" w:cs="Courier New"/>
+        </w:rPr>
+      </w:pPr>
+      <w:r>
+        <w:rPr>
+          <w:rFonts w:ascii="Courier New" w:hAnsi="Courier New" w:cs="Courier New"/>
+        </w:rPr>
         <w:lastRenderedPageBreak/>
-        <w:t xml:space="preserve">            &lt;URI&gt;/job</w:t>
-      </w:r>
-      <w:proofErr w:type="gramStart"/>
-      <w:r>
-        <w:rPr>
-          <w:rFonts w:ascii="Courier New" w:hAnsi="Courier New" w:cs="Courier New"/>
-          <w:b/>
-          <w:color w:val="FF0000"/>
-        </w:rPr>
-        <w:t>/{</w:t>
-      </w:r>
-      <w:proofErr w:type="gramEnd"/>
-      <w:r>
-        <w:rPr>
-          <w:rFonts w:ascii="Courier New" w:hAnsi="Courier New" w:cs="Courier New"/>
-          <w:b/>
-          <w:color w:val="FF0000"/>
-        </w:rPr>
-        <w:t>id}/{</w:t>
-      </w:r>
-      <w:proofErr w:type="spellStart"/>
-      <w:r>
-        <w:rPr>
-          <w:rFonts w:ascii="Courier New" w:hAnsi="Courier New" w:cs="Courier New"/>
-          <w:b/>
-          <w:color w:val="FF0000"/>
-        </w:rPr>
-        <w:t>phaseName</w:t>
-      </w:r>
-      <w:proofErr w:type="spellEnd"/>
-      <w:r>
-        <w:rPr>
-          <w:rFonts w:ascii="Courier New" w:hAnsi="Courier New" w:cs="Courier New"/>
-          <w:b/>
-          <w:color w:val="FF0000"/>
-        </w:rPr>
-        <w:t>}/states/state&lt;/URI&gt;</w:t>
-      </w:r>
-    </w:p>
-    <w:p>
-      <w:pPr>
-        <w:spacing w:after="0"/>
-        <w:rPr>
-          <w:rFonts w:ascii="Courier New" w:hAnsi="Courier New" w:cs="Courier New"/>
-          <w:b/>
-          <w:color w:val="FF0000"/>
-        </w:rPr>
-      </w:pPr>
-      <w:r>
-        <w:rPr>
-          <w:rFonts w:ascii="Courier New" w:hAnsi="Courier New" w:cs="Courier New"/>
-          <w:b/>
-          <w:color w:val="FF0000"/>
-        </w:rPr>
-        <w:t xml:space="preserve">            &lt;Ref&gt;</w:t>
-      </w:r>
-    </w:p>
-    <w:p>
-      <w:pPr>
-        <w:spacing w:after="0"/>
-        <w:rPr>
-          <w:rFonts w:ascii="Courier New" w:hAnsi="Courier New" w:cs="Courier New"/>
-          <w:b/>
-          <w:color w:val="FF0000"/>
-        </w:rPr>
-      </w:pPr>
-      <w:r>
-        <w:rPr>
-          <w:rFonts w:ascii="Courier New" w:hAnsi="Courier New" w:cs="Courier New"/>
-          <w:b/>
-          <w:color w:val="FF0000"/>
-        </w:rPr>
-        <w:t xml:space="preserve">               </w:t>
-      </w:r>
-      <w:proofErr w:type="spellStart"/>
-      <w:r>
-        <w:rPr>
-          <w:rFonts w:ascii="Courier New" w:hAnsi="Courier New" w:cs="Courier New"/>
-          <w:b/>
-          <w:color w:val="FF0000"/>
-        </w:rPr>
-        <w:t>infraPaths.yaml</w:t>
-      </w:r>
-      <w:proofErr w:type="spellEnd"/>
-      <w:r>
-        <w:rPr>
-          <w:rFonts w:ascii="Courier New" w:hAnsi="Courier New" w:cs="Courier New"/>
-          <w:b/>
-          <w:color w:val="FF0000"/>
-        </w:rPr>
-        <w:t>#/</w:t>
-      </w:r>
-      <w:proofErr w:type="spellStart"/>
-      <w:r>
-        <w:rPr>
-          <w:rFonts w:ascii="Courier New" w:hAnsi="Courier New" w:cs="Courier New"/>
-          <w:b/>
-          <w:color w:val="FF0000"/>
-        </w:rPr>
-        <w:t>infraPaths</w:t>
-      </w:r>
-      <w:proofErr w:type="spellEnd"/>
-      <w:r>
-        <w:rPr>
-          <w:rFonts w:ascii="Courier New" w:hAnsi="Courier New" w:cs="Courier New"/>
-          <w:b/>
-          <w:color w:val="FF0000"/>
-        </w:rPr>
-        <w:t>/</w:t>
-      </w:r>
-      <w:proofErr w:type="spellStart"/>
-      <w:r>
-        <w:rPr>
-          <w:rFonts w:ascii="Courier New" w:hAnsi="Courier New" w:cs="Courier New"/>
-          <w:b/>
-          <w:color w:val="FF0000"/>
-        </w:rPr>
-        <w:t>jobPhaseStatesPost</w:t>
-      </w:r>
-      <w:proofErr w:type="spellEnd"/>
-    </w:p>
-    <w:p>
-      <w:pPr>
-        <w:spacing w:after="0"/>
-        <w:rPr>
-          <w:rFonts w:ascii="Courier New" w:hAnsi="Courier New" w:cs="Courier New"/>
-          <w:b/>
-          <w:color w:val="FF0000"/>
-        </w:rPr>
-      </w:pPr>
-      <w:r>
-        <w:rPr>
-          <w:rFonts w:ascii="Courier New" w:hAnsi="Courier New" w:cs="Courier New"/>
-          <w:b/>
-          <w:color w:val="FF0000"/>
-        </w:rPr>
-        <w:t xml:space="preserve">            &lt;/Ref&gt;</w:t>
-      </w:r>
-    </w:p>
-    <w:p>
-      <w:pPr>
-        <w:spacing w:after="0"/>
-        <w:rPr>
-          <w:rFonts w:ascii="Courier New" w:hAnsi="Courier New" w:cs="Courier New"/>
-        </w:rPr>
-      </w:pPr>
-      <w:r>
-        <w:rPr>
-          <w:rFonts w:ascii="Courier New" w:hAnsi="Courier New" w:cs="Courier New"/>
-        </w:rPr>
-        <w:t xml:space="preserve">         &lt;/Path&gt;</w:t>
-      </w:r>
-    </w:p>
-    <w:p>
-      <w:pPr>
-        <w:spacing w:after="0"/>
-        <w:rPr>
-          <w:rFonts w:ascii="Courier New" w:hAnsi="Courier New" w:cs="Courier New"/>
-        </w:rPr>
-      </w:pPr>
-      <w:r>
-        <w:rPr>
-          <w:rFonts w:ascii="Courier New" w:hAnsi="Courier New" w:cs="Courier New"/>
-        </w:rPr>
-        <w:t xml:space="preserve">      &lt;/Paths&gt;</w:t>
-      </w:r>
-    </w:p>
-    <w:p>
-      <w:pPr>
-        <w:spacing w:after="0"/>
-        <w:rPr>
-          <w:rFonts w:ascii="Courier New" w:hAnsi="Courier New" w:cs="Courier New"/>
-        </w:rPr>
-      </w:pPr>
-      <w:r>
-        <w:rPr>
-          <w:rFonts w:ascii="Courier New" w:hAnsi="Courier New" w:cs="Courier New"/>
-        </w:rPr>
-        <w:t xml:space="preserve">   &lt;/OpenAPI&gt;</w:t>
-      </w:r>
-    </w:p>
-    <w:p>
-      <w:pPr>
-        <w:spacing w:after="0"/>
-        <w:rPr>
-          <w:rFonts w:ascii="Courier New" w:hAnsi="Courier New" w:cs="Courier New"/>
-        </w:rPr>
-      </w:pPr>
-      <w:r>
-        <w:rPr>
-          <w:rFonts w:ascii="Courier New" w:hAnsi="Courier New" w:cs="Courier New"/>
-        </w:rPr>
-        <w:t xml:space="preserve">   ...</w:t>
-      </w:r>
-    </w:p>
-    <w:p>
-      <w:pPr>
-        <w:spacing w:after="0"/>
-        <w:rPr>
-          <w:rFonts w:ascii="Courier New" w:hAnsi="Courier New" w:cs="Courier New"/>
-        </w:rPr>
-      </w:pPr>
-      <w:r>
-        <w:rPr>
-          <w:rFonts w:ascii="Courier New" w:hAnsi="Courier New" w:cs="Courier New"/>
-        </w:rPr>
-        <w:t>&lt;</w:t>
-      </w:r>
-      <w:r>
-        <w:rPr>
-          <w:rFonts w:ascii="Courier New" w:hAnsi="Courier New" w:cs="Courier New"/>
-        </w:rPr>
-        <w:t>/</w:t>
-      </w:r>
-      <w:proofErr w:type="spellStart"/>
-      <w:r>
-        <w:rPr>
-          <w:rFonts w:ascii="Courier New" w:hAnsi="Courier New" w:cs="Courier New"/>
-        </w:rPr>
-        <w:t>DataObject</w:t>
-      </w:r>
-      <w:proofErr w:type="spellEnd"/>
-      <w:r>
-        <w:rPr>
-          <w:rFonts w:ascii="Courier New" w:hAnsi="Courier New" w:cs="Courier New"/>
-        </w:rPr>
-        <w:t>&gt;</w:t>
-      </w:r>
-    </w:p>
-    <w:p>
-      <w:pPr>
-        <w:pStyle w:val="Heading2"/>
-      </w:pPr>
-      <w:bookmarkStart w:id="6" w:name="_Toc73345488"/>
-      <w:r>
-        <w:t>Group</w:t>
-      </w:r>
-      <w:r>
-        <w:t xml:space="preserve"> – &lt;OpenAPI&gt; Elements</w:t>
-      </w:r>
-      <w:bookmarkEnd w:id="6"/>
-    </w:p>
-    <w:p>
-      <w:r>
-        <w:t xml:space="preserve">The SpecGen source files may have some objects grouped </w:t>
-      </w:r>
-      <w:r>
-        <w:t>within</w:t>
-      </w:r>
-      <w:r>
-        <w:t xml:space="preserve"> a certain area; however these objects are not top-level objects that should be appearing in the final Open API definition as an endpoint. One such object is the ‘</w:t>
-      </w:r>
-      <w:proofErr w:type="spellStart"/>
-      <w:r>
-        <w:t>deleteRequest</w:t>
-      </w:r>
-      <w:proofErr w:type="spellEnd"/>
-      <w:r>
-        <w:t xml:space="preserve">’ in the infrastructure data model that is listed in the ‘request’ group. This object is an object that is used as payload for a standard data model delete request but it is not an endpoint in its own right, so that object as well as the group it belongs should not form part of the Open API </w:t>
-      </w:r>
-      <w:r>
-        <w:t xml:space="preserve">endpoint </w:t>
-      </w:r>
-      <w:r>
-        <w:t>definition.</w:t>
-      </w:r>
-    </w:p>
-    <w:p>
-      <w:r>
-        <w:t>How to exclude a specific &lt;</w:t>
-      </w:r>
-      <w:proofErr w:type="spellStart"/>
-      <w:r>
-        <w:t>DataObject</w:t>
-      </w:r>
-      <w:proofErr w:type="spellEnd"/>
-      <w:r>
-        <w:t>&gt; from the output has been described in the previous section. Just excluding the unnecessary objects would still</w:t>
-      </w:r>
-      <w:r>
-        <w:t xml:space="preserve"> produce the group name i</w:t>
-      </w:r>
-      <w:r>
-        <w:t>n the final OpenAPI yaml file without any objects. To also exclude the group name/heading from the final Open API yaml the following &lt;OpenAPI&gt; element can be added to the &lt;Group&gt; element:</w:t>
-      </w:r>
-    </w:p>
-    <w:p>
-      <w:pPr>
-        <w:spacing w:after="0"/>
-        <w:rPr>
-          <w:b/>
-        </w:rPr>
-      </w:pPr>
-      <w:r>
-        <w:rPr>
-          <w:b/>
-        </w:rPr>
-        <w:t>Example:</w:t>
-      </w:r>
-    </w:p>
-    <w:p>
-      <w:pPr>
-        <w:spacing w:after="0"/>
-        <w:rPr>
-          <w:rFonts w:ascii="Courier New" w:hAnsi="Courier New" w:cs="Courier New"/>
-        </w:rPr>
-      </w:pPr>
-      <w:r>
-        <w:rPr>
-          <w:rFonts w:ascii="Courier New" w:hAnsi="Courier New" w:cs="Courier New"/>
-        </w:rPr>
-        <w:t>&lt;Group name="..."&gt;</w:t>
-      </w:r>
-    </w:p>
-    <w:p>
-      <w:pPr>
-        <w:spacing w:after="0"/>
-        <w:rPr>
-          <w:rFonts w:ascii="Courier New" w:hAnsi="Courier New" w:cs="Courier New"/>
-        </w:rPr>
-      </w:pPr>
-      <w:r>
-        <w:rPr>
-          <w:rFonts w:ascii="Courier New" w:hAnsi="Courier New" w:cs="Courier New"/>
-        </w:rPr>
-        <w:t xml:space="preserve">   &lt;OpenAPI&gt;</w:t>
-      </w:r>
-    </w:p>
-    <w:p>
-      <w:pPr>
-        <w:spacing w:after="0"/>
-        <w:rPr>
-          <w:rFonts w:ascii="Courier New" w:hAnsi="Courier New" w:cs="Courier New"/>
-          <w:b/>
-        </w:rPr>
-      </w:pPr>
-      <w:r>
-        <w:rPr>
-          <w:rFonts w:ascii="Courier New" w:hAnsi="Courier New" w:cs="Courier New"/>
-        </w:rPr>
-        <w:t xml:space="preserve">      </w:t>
-      </w:r>
-      <w:r>
-        <w:rPr>
-          <w:rFonts w:ascii="Courier New" w:hAnsi="Courier New" w:cs="Courier New"/>
-          <w:b/>
-          <w:color w:val="FF0000"/>
-        </w:rPr>
-        <w:t>&lt;</w:t>
-      </w:r>
-      <w:proofErr w:type="spellStart"/>
-      <w:r>
-        <w:rPr>
-          <w:rFonts w:ascii="Courier New" w:hAnsi="Courier New" w:cs="Courier New"/>
-          <w:b/>
-          <w:color w:val="FF0000"/>
-        </w:rPr>
-        <w:t>ExcludeGroupName</w:t>
-      </w:r>
-      <w:proofErr w:type="spellEnd"/>
-      <w:r>
-        <w:rPr>
-          <w:rFonts w:ascii="Courier New" w:hAnsi="Courier New" w:cs="Courier New"/>
-          <w:b/>
-          <w:color w:val="FF0000"/>
-        </w:rPr>
-        <w:t>&gt;true&lt;/</w:t>
-      </w:r>
-      <w:proofErr w:type="spellStart"/>
-      <w:r>
-        <w:rPr>
-          <w:rFonts w:ascii="Courier New" w:hAnsi="Courier New" w:cs="Courier New"/>
-          <w:b/>
-          <w:color w:val="FF0000"/>
-        </w:rPr>
-        <w:t>ExcludeGroupName</w:t>
-      </w:r>
-      <w:proofErr w:type="spellEnd"/>
-      <w:r>
-        <w:rPr>
-          <w:rFonts w:ascii="Courier New" w:hAnsi="Courier New" w:cs="Courier New"/>
-          <w:b/>
-          <w:color w:val="FF0000"/>
-        </w:rPr>
-        <w:t>&gt;</w:t>
-      </w:r>
-    </w:p>
-    <w:p>
-      <w:pPr>
-        <w:spacing w:after="0"/>
-        <w:rPr>
-          <w:rFonts w:ascii="Courier New" w:hAnsi="Courier New" w:cs="Courier New"/>
-        </w:rPr>
-      </w:pPr>
-      <w:r>
-        <w:rPr>
-          <w:rFonts w:ascii="Courier New" w:hAnsi="Courier New" w:cs="Courier New"/>
-        </w:rPr>
         <w:t xml:space="preserve">   &lt;/OpenAPI&gt;</w:t>
       </w:r>
     </w:p>
@@ -4473,7 +4680,7 @@
               <w:rPr>
                 <w:noProof/>
               </w:rPr>
-              <w:t>23 August 2021</w:t>
+              <w:t>25 June 2024</w:t>
             </w:r>
             <w:r>
               <w:fldChar w:fldCharType="end"/>
@@ -4511,7 +4718,7 @@
                 <w:bCs/>
                 <w:noProof/>
               </w:rPr>
-              <w:t>2</w:t>
+              <w:t>3</w:t>
             </w:r>
             <w:r>
               <w:rPr>
@@ -4551,7 +4758,7 @@
                 <w:bCs/>
                 <w:noProof/>
               </w:rPr>
-              <w:t>6</w:t>
+              <w:t>7</w:t>
             </w:r>
             <w:r>
               <w:rPr>
@@ -6440,7 +6647,7 @@
 </file>
 
 <file path=customXml/itemProps1.xml><?xml version="1.0" encoding="utf-8"?>
-<ds:datastoreItem xmlns:ds="http://schemas.openxmlformats.org/officeDocument/2006/customXml" ds:itemID="{8F38EDA0-D8B9-4955-96A1-33044779ADF2}">
+<ds:datastoreItem xmlns:ds="http://schemas.openxmlformats.org/officeDocument/2006/customXml" ds:itemID="{4817C954-92EF-4B69-B9DF-379CCBC1B4A8}">
   <ds:schemaRefs>
     <ds:schemaRef ds:uri="http://schemas.openxmlformats.org/officeDocument/2006/bibliography"/>
   </ds:schemaRefs>

</xml_diff>